<commit_message>
fixed a bit more up to the wrangling - need to do the quarto
</commit_message>
<xml_diff>
--- a/docs/content/summary_stats/summary_stats_lecture.docx
+++ b/docs/content/summary_stats/summary_stats_lecture.docx
@@ -31,7 +31,7 @@
         <w:pStyle w:val="Date"/>
       </w:pPr>
       <w:r>
-        <w:t xml:space="preserve">2026-09-22</w:t>
+        <w:t xml:space="preserve">2026-09-23</w:t>
       </w:r>
     </w:p>
     <w:bookmarkStart w:id="12" w:name="where-we-left-off-lecture-05-wrangling"/>
@@ -6979,25 +6979,25 @@
         <w:rPr>
           <w:rStyle w:val="VerbatimChar"/>
         </w:rPr>
-        <w:t xml:space="preserve">      n  mean variance    sd    se ci_lower ci_upper</w:t>
-      </w:r>
-      <w:r>
-        <w:br/>
-      </w:r>
-      <w:r>
-        <w:rPr>
-          <w:rStyle w:val="VerbatimChar"/>
-        </w:rPr>
-        <w:t xml:space="preserve">  &lt;int&gt; &lt;dbl&gt;    &lt;dbl&gt; &lt;dbl&gt; &lt;dbl&gt;    &lt;dbl&gt;    &lt;dbl&gt;</w:t>
-      </w:r>
-      <w:r>
-        <w:br/>
-      </w:r>
-      <w:r>
-        <w:rPr>
-          <w:rStyle w:val="VerbatimChar"/>
-        </w:rPr>
-        <w:t xml:space="preserve">1    25  0.51     0.04  0.21  0.04     0.42     0.59</w:t>
+        <w:t xml:space="preserve">      n  mean variance    sd     se ci_lower ci_upper</w:t>
+      </w:r>
+      <w:r>
+        <w:br/>
+      </w:r>
+      <w:r>
+        <w:rPr>
+          <w:rStyle w:val="VerbatimChar"/>
+        </w:rPr>
+        <w:t xml:space="preserve">  &lt;int&gt; &lt;dbl&gt;    &lt;dbl&gt; &lt;dbl&gt;  &lt;dbl&gt;    &lt;dbl&gt;    &lt;dbl&gt;</w:t>
+      </w:r>
+      <w:r>
+        <w:br/>
+      </w:r>
+      <w:r>
+        <w:rPr>
+          <w:rStyle w:val="VerbatimChar"/>
+        </w:rPr>
+        <w:t xml:space="preserve">1    25 0.505   0.0442 0.210 0.0421    0.418    0.592</w:t>
       </w:r>
     </w:p>
     <w:p>
@@ -7590,34 +7590,34 @@
         <w:rPr>
           <w:rStyle w:val="VerbatimChar"/>
         </w:rPr>
-        <w:t xml:space="preserve">  shade     n  mean variance    sd    se ci_lower ci_upper</w:t>
-      </w:r>
-      <w:r>
-        <w:br/>
-      </w:r>
-      <w:r>
-        <w:rPr>
-          <w:rStyle w:val="VerbatimChar"/>
-        </w:rPr>
-        <w:t xml:space="preserve">  &lt;chr&gt; &lt;int&gt; &lt;dbl&gt;    &lt;dbl&gt; &lt;dbl&gt; &lt;dbl&gt;    &lt;dbl&gt;    &lt;dbl&gt;</w:t>
-      </w:r>
-      <w:r>
-        <w:br/>
-      </w:r>
-      <w:r>
-        <w:rPr>
-          <w:rStyle w:val="VerbatimChar"/>
-        </w:rPr>
-        <w:t xml:space="preserve">1 shady    28  0.52     0.02  0.15  0.03     0.47     0.58</w:t>
-      </w:r>
-      <w:r>
-        <w:br/>
-      </w:r>
-      <w:r>
-        <w:rPr>
-          <w:rStyle w:val="VerbatimChar"/>
-        </w:rPr>
-        <w:t xml:space="preserve">2 sunny    25  0.51     0.04  0.21  0.04     0.42     0.59</w:t>
+        <w:t xml:space="preserve">  shade     n  mean variance    sd     se ci_lower ci_upper</w:t>
+      </w:r>
+      <w:r>
+        <w:br/>
+      </w:r>
+      <w:r>
+        <w:rPr>
+          <w:rStyle w:val="VerbatimChar"/>
+        </w:rPr>
+        <w:t xml:space="preserve">  &lt;chr&gt; &lt;int&gt; &lt;dbl&gt;    &lt;dbl&gt; &lt;dbl&gt;  &lt;dbl&gt;    &lt;dbl&gt;    &lt;dbl&gt;</w:t>
+      </w:r>
+      <w:r>
+        <w:br/>
+      </w:r>
+      <w:r>
+        <w:rPr>
+          <w:rStyle w:val="VerbatimChar"/>
+        </w:rPr>
+        <w:t xml:space="preserve">1 shady    28 0.523   0.0219 0.148 0.0280    0.466    0.580</w:t>
+      </w:r>
+      <w:r>
+        <w:br/>
+      </w:r>
+      <w:r>
+        <w:rPr>
+          <w:rStyle w:val="VerbatimChar"/>
+        </w:rPr>
+        <w:t xml:space="preserve">2 sunny    25 0.505   0.0442 0.210 0.0421    0.418    0.592</w:t>
       </w:r>
     </w:p>
     <w:p>

</xml_diff>